<commit_message>
fix: re-verify 34 files after correcting sample years of experience
The summaries and cover letters in 11 sets counted years of experience as if
it were two years earlier than the Oct 2026 letter date (Plain said three
years for jobs that started in Aug 2021). The 34 changed resumes and cover
letters were published as new documents and every check was run again.
All 34 pass.
</commit_message>
<xml_diff>
--- a/fixtures/career-change/career-change-cover-letter-a4.docx
+++ b/fixtures/career-change/career-change-cover-letter-a4.docx
@@ -127,7 +127,7 @@
         <w:rPr>
           <w:rtl w:val="0"/>
         </w:rPr>
-        <w:t xml:space="preserve">I'm applying for the Junior Data Analyst position on your sales operations team. I've managed retail stores for eight years, and for the last two I've been doing the analysis behind my own decisions in SQL and Tableau. I'm ready to make that my full-time job.</w:t>
+        <w:t xml:space="preserve">I'm applying for the Junior Data Analyst position on your sales operations team. I've managed retail stores for ten years, and for the last two I've been doing the analysis behind my own decisions in SQL and Tableau. I'm ready to make that my full-time job.</w:t>
       </w:r>
     </w:p>
     <w:p>
@@ -153,7 +153,7 @@
         <w:rPr>
           <w:rtl w:val="0"/>
         </w:rPr>
-        <w:t xml:space="preserve">I know I'd be new to the title. What I bring is eight years of knowing what store and warehouse numbers mean on the ground, and a habit of explaining them to people who don't work with data all day.</w:t>
+        <w:t xml:space="preserve">I know I'd be new to the title. What I bring is ten years of knowing what store and warehouse numbers mean on the ground, and a habit of explaining them to people who don't work with data all day.</w:t>
       </w:r>
     </w:p>
     <w:p>

</xml_diff>